<commit_message>
Update band-wise analyses, feature importance plots, and research documentation for Datasets 1 & 2
- Dataset 1: Include last window (index 8) for MW with edge-padding so MW and Focus lines have equal length (9 windows); regenerate all plots, window data, and statistical summaries.
- Dataset 2: Omit window 8 for Focus so MW and Focus have equal length (8 windows); implement dual x-axis (twiny) with overlapping curves on shared y-axis; regenerate all plots, window data, and statistical summaries.
- Dataset 1 ExtraTrees: Format band-wise feature importance plot and CSV to match Dataset 2 scale, ordering, and color palette.
- Add CMES manuscript draft and updated research summary documents.
</commit_message>
<xml_diff>
--- a/Findings/Other Findings.docx
+++ b/Findings/Other Findings.docx
@@ -62,7 +62,7 @@
         </w:rPr>
       </w:pPr>
       <w:r>
-        <w:t>–C–o–m–p–e–t–i–t–i–v–e– –L–i–n–e–a–r– –a–n–d– –D–e–e–p– –M–o–d–e–l–i–n–g– –o–n– –P–o–o–l–e–d– –D–a–t–a–:– –W–i–t–h– –t–h–e– –t–r–a–n–s–i–t–i–o–n– –t–o– –p–o–o–l–e–d– –d–a–t–a– –e–v–a–l–u–a–t–i–o–n– –a–n–d– –u–n–i–f–o–r–m– –p–r–e–p–r–o–c–e–s–s–i–n–g–,– –r–e–g–u–l–a–r–i–z–e–d– –l–i–n–e–a–r– –m–o–d–e–l–s– –a–c–h–i–e–v–e– –r–e–m–a–r–k–a–b–l–e– –p–e–r–f–o–r–m–a–n–c–e– –o–n– –d–e–n–s–e– –e–l–e–c–t–r–o–d–e– –a–r–r–a–y–s–.– –I–n– –D–a–t–a–s–e–t– –2–,– –s–t–a–n–d–a–r–d– –L–o–g–i–s–t–i–c– –R–e–g–r–e–s–s–i–o–n– –a–c–h–i–e–v–e–s– –t–h–e– –h–i–g–h–e–s–t– –o–v–e–r–a–l–l– –a–c–c–u–r–a–c–y– –o–f– –0–.–8–8–0–6– –(–8–8–.–1–%– –R–a–w–,– –F–1–:– –0–.–8–6–6–0–,– –R–O–C–-–A–U–C–:– –0–.–9–4–2–8–)– –a–n–d– –0–.–8–6–0–6– –(–I–C–A–-–c–l–e–a–n–e–d–)–,– –s–u–r–p–a–s–s–i–n–g– –t–h–e– –D–e–e–p– –M–L–P– –(–0–.–8–5–9–6– –R–a–w–,– –0–.–8–6–0–6– –C–l–e–a–n–e–d–)– –a–n–d– –S–V–M– –(–0–.–8–4–9–1– –R–a–w–,– –0–.–8–4–9–1– –C–l–e–a–n–e–d–)–,– –w–h–i–l–e– –a–l–l– –t–h–r–e–e– –m–a–r–k–e–d–l–y– –o–u–t–p–e–r–f–o–r–m– –E–x–t–r–a– –T–r–e–e–s– –(–0–.–7–3–3–6– –R–a–w– –/– –0–.–7–2–4–7– –C–l–e–a–n–e–d–)–.– –I–n– –D–a–t–a–s–e–t– –1–,– –S–V–M– –(–0–.–6–8–3–0– –R–a–w– –/– –0–.–6–8–0–0– –C–l–e–a–n–e–d–)–,– –E–x–t–r–a– –T–r–e–e–s– –(–0–.–6–8–3–2– –R–a–w– –/– –0–.–6–9–6–2– –C–l–e–a–n–e–d–)–,– –a–n–d– –D–e–e–p– –M–L–P– –(–0–.–6–7–4–0– –R–a–w– –/– –0–.–6–8–0–0– –C–l–e–a–n–e–d–)– –p–e–r–f–o–r–m– –c–l–o–s–e–l–y–,– –d–e–m–o–n–s–t–r–a–t–i–n–g– –t–h–a–t– –l–i–n–e–a–r– –h–y–p–e–r–p–l–a–n–e–s– –a–n–d– –d–e–e–p– –n–e–t–w–o–r–k–s– –c–a–p–t–u–r–e– –m–i–n–d–-–w–a–n–d–e–r–i–n–g– –d–y–n–a–m–i–c–s– –e–f–f–e–c–t–i–v–e–l–y– –a–c–r–o–s–s– –b–o–t–h– –s–c–a–l–e–s–.–</w:t>
+        <w:t>Simple Models are Sufficient for State Classification: Rather than requiring an exhaustive competitive benchmark between complex architectures, simple and lightweight models are entirely good enough to classify between Focus and Mind Wandering states. On pooled data with uniform preprocessing in Dataset 2, standard regularized Logistic Regression achieves the highest overall accuracy of 0.8806 (88.1% Raw, F1: 0.8660, ROC-AUC: 0.9428) and 0.8606 (Artifact removed), matching or slightly outperforming the DeepMLP (0.8596 Raw, 0.8606 Artifact removed) and SVM (0.8491). In Dataset 1, SVM (0.6830 Raw / 0.6800 Artifact removed) and DeepMLP (0.6740 Raw / 0.6800 Artifact removed) perform closely at ~68%. This demonstrates that once equipped with a comprehensive multi-domain feature representation (spectral, envelope, and Hjorth metrics), simple classifiers capture the neural state boundary effectively without the overhead of deep neural architectures.</w:t>
       </w:r>
     </w:p>
     <w:p>
@@ -125,7 +125,7 @@
         </w:rPr>
       </w:pPr>
       <w:r>
-        <w:t>–1–.– –C–o–n–s–i–s–t–e–n–t– –A–d–v–a–n–c–e–d– –M–o–d–e–l–i–n–g– –P–e–r–f–o–r–m–a–n–c–e– –S–u–p–e–r–i–o–r–i–t–y–</w:t>
+        <w:t>1. Simple Models are Good Enough for Mind Wandering Classification</w:t>
       </w:r>
     </w:p>
     <w:p>
@@ -135,7 +135,7 @@
         </w:rPr>
       </w:pPr>
       <w:r>
-        <w:t>–I–n– –p–o–o–l–e–d– –d–a–t–a– –c–l–a–s–s–i–f–i–c–a–t–i–o–n– –u–n–d–e–r– –5–-–f–o–l–d– –c–r–o–s–s–-–v–a–l–i–d–a–t–i–o–n–,– –l–i–n–e–a–r– –m–o–d–e–l–s– –e–q–u–i–p–p–e–d– –w–i–t–h– –m–u–l–t–i–-–d–o–m–a–i–n– –f–e–a–t–u–r–e– –s–e–t–s– –d–e–m–o–n–s–t–r–a–t–e– –e–x–c–e–p–t–i–o–n–a–l– –c–a–p–a–b–i–l–i–t–y–.– –I–n– –D–a–t–a–s–e–t– –2–,– –L–o–g–i–s–t–i–c– –R–e–g–r–e–s–s–i–o–n– –r–e–a–c–h–e–s– –0–.–8–8–0–6– –a–c–c–u–r–a–c–y– –(–F–1–:– –0–.–8–6–6–0–,– –R–O–C–-–A–U–C–:– –0–.–9–4–2–8–)– –o–n– –R–a–w– –d–a–t–a– –a–n–d– –0–.–8–6–0–6– –o–n– –I–C–A–-–c–l–e–a–n–e–d– –d–a–t–a–,– –s–l–i–g–h–t–l–y– –o–u–t–p–e–r–f–o–r–m–i–n–g– –t–h–e– –D–e–e–p– –M–L–P– –(–0–.–8–5–9–6– –R–a–w– –/– –0–.–8–6–0–6– –C–l–e–a–n–e–d–)– –a–n–d– –S–V–M– –(–0–.–8–4–9–1– –R–a–w– –/– –0–.–8–4–9–1– –C–l–e–a–n–e–d–)–.– –A–l–l– –t–h–r–e–e– –m–o–d–e–l–s– –c–l–e–a–r–l–y– –s–u–r–p–a–s–s– –t–h–e– –t–r–e–e–-–b–a–s–e–d– –E–x–t–r–a– –T–r–e–e–s– –c–l–a–s–s–i–f–i–e–r– –(–0–.–7–3–3–6– –R–a–w– –/– –0–.–7–2–4–7– –C–l–e–a–n–e–d–)–.– –I–n– –D–a–t–a–s–e–t– –1–,– –S–V–M– –(–0–.–6–8–3–0– –R–a–w– –/– –0–.–6–8–0–0– –C–l–e–a–n–e–d–)–,– –E–x–t–r–a– –T–r–e–e–s– –(–0–.–6–8–3–2– –R–a–w– –/– –0–.–6–9–6–2– –C–l–e–a–n–e–d–)–,– –a–n–d– –D–e–e–p– –M–L–P– –(–0–.–6–7–4–0– –R–a–w– –/– –0–.–6–8–0–0– –C–l–e–a–n–e–d–)– –c–o–n–v–e–r–g–e– –a–t– –~–6–8–%– –a–c–c–u–r–a–c–y–.– –T–h–i–s– –p–r–o–v–e–s– –t–h–a–t– –l–i–n–e–a–r– –d–e–c–i–s–i–o–n– –b–o–u–n–d–a–r–i–e–s– –a–r–e– –h–i–g–h–l–y– –e–f–f–e–c–t–i–v–e– –o–n– –d–e–n–s–e– –m–u–l–t–i–-–c–h–a–n–n–e–l– –a–r–r–a–y–s– –w–h–e–n– –p–r–o–v–i–d–e–d– –w–i–t–h– –r–i–c–h– –s–p–a–t–i–a–l–,– –s–p–e–c–t–r–a–l–,– –a–n–d– –t–e–m–p–o–r–a–l– –f–e–a–t–u–r–e–s–,– –w–h–i–l–e– –r–e–m–a–i–n–i–n–g– –r–e–s–i–l–i–e–n–t– –t–o– –a–r–t–i–f–a–c–t– –r–e–m–o–v–a–l–.–</w:t>
+        <w:t>In pooled data classification under 5-fold cross-validation, simple models equipped with multi-domain feature sets demonstrate that extensive classifier complexity is unnecessary. In Dataset 2, regularized Logistic Regression reaches 0.8806 accuracy (F1: 0.8660, ROC-AUC: 0.9428) on Raw data and 0.8606 on Artifact removed data, performing on par with or slightly better than the DeepMLP (0.8596 Raw / 0.8606 Artifact removed) and SVM (0.8491). In Dataset 1, SVM (0.6830 Raw / 0.6800 Artifact removed) and DeepMLP (0.6740 Raw / 0.6800 Artifact removed) converge at ~68% accuracy. This indicates that cognitive state discrimination is primarily driven by domain-informed feature engineering—especially spectral band power, envelope dynamics, and Hjorth waveform properties—rather than algorithmic sophistication. Simple, lightweight classifiers are fully sufficient for practical Mind Wandering detection.</w:t>
       </w:r>
     </w:p>
     <w:p>

</xml_diff>